<commit_message>
docs: update report — email, expanded Run Local section, tighter spacing
- Fix email to sarkissian.a@northeastern.edu
- Expand Run Local into dedicated subsection 4.3 (~600 words):
  VRAM formula, speed estimation, Apple Silicon note, scatter plot
  design, and cross-ecosystem intelligence score comparison
- Renumber 4.3→4.4 Design Principles, 4.4→4.5 Technical Stack
- Tighten body paragraph spacing to fit ~6 pages

Co-Authored-By: Claude Sonnet 4.6 <noreply@anthropic.com>
</commit_message>
<xml_diff>
--- a/FinalReport_Sarkissian.docx
+++ b/FinalReport_Sarkissian.docx
@@ -77,7 +77,7 @@
           <w:color w:val="505050"/>
           <w:sz w:val="22"/>
         </w:rPr>
-        <w:t>avohsarkissian@gmail.com</w:t>
+        <w:t>sarkissian.a@northeastern.edu</w:t>
       </w:r>
     </w:p>
     <w:p>
@@ -106,7 +106,7 @@
     <w:p>
       <w:pPr>
         <w:jc w:val="both"/>
-        <w:spacing w:before="0" w:after="120" w:line="276" w:lineRule="auto"/>
+        <w:spacing w:before="0" w:after="60" w:line="271" w:lineRule="auto"/>
       </w:pPr>
       <w:r>
         <w:rPr>
@@ -136,7 +136,7 @@
     <w:p>
       <w:pPr>
         <w:jc w:val="both"/>
-        <w:spacing w:before="0" w:after="120" w:line="276" w:lineRule="auto"/>
+        <w:spacing w:before="0" w:after="60" w:line="271" w:lineRule="auto"/>
         <w:ind w:firstLine="432"/>
       </w:pPr>
       <w:r>
@@ -152,7 +152,7 @@
     <w:p>
       <w:pPr>
         <w:jc w:val="both"/>
-        <w:spacing w:before="0" w:after="120" w:line="276" w:lineRule="auto"/>
+        <w:spacing w:before="0" w:after="60" w:line="271" w:lineRule="auto"/>
         <w:ind w:firstLine="432"/>
       </w:pPr>
       <w:r>
@@ -168,7 +168,7 @@
     <w:p>
       <w:pPr>
         <w:jc w:val="both"/>
-        <w:spacing w:before="0" w:after="120" w:line="276" w:lineRule="auto"/>
+        <w:spacing w:before="0" w:after="60" w:line="271" w:lineRule="auto"/>
         <w:ind w:firstLine="432"/>
       </w:pPr>
       <w:r>
@@ -184,7 +184,7 @@
     <w:p>
       <w:pPr>
         <w:jc w:val="both"/>
-        <w:spacing w:before="0" w:after="120" w:line="276" w:lineRule="auto"/>
+        <w:spacing w:before="0" w:after="60" w:line="271" w:lineRule="auto"/>
         <w:ind w:firstLine="432"/>
       </w:pPr>
       <w:r>
@@ -230,7 +230,7 @@
     <w:p>
       <w:pPr>
         <w:jc w:val="both"/>
-        <w:spacing w:before="0" w:after="120" w:line="276" w:lineRule="auto"/>
+        <w:spacing w:before="0" w:after="60" w:line="271" w:lineRule="auto"/>
         <w:ind w:firstLine="432"/>
       </w:pPr>
       <w:r>
@@ -246,7 +246,7 @@
     <w:p>
       <w:pPr>
         <w:jc w:val="both"/>
-        <w:spacing w:before="0" w:after="120" w:line="276" w:lineRule="auto"/>
+        <w:spacing w:before="0" w:after="60" w:line="271" w:lineRule="auto"/>
         <w:ind w:firstLine="432"/>
       </w:pPr>
       <w:r>
@@ -277,7 +277,7 @@
     <w:p>
       <w:pPr>
         <w:jc w:val="both"/>
-        <w:spacing w:before="0" w:after="120" w:line="276" w:lineRule="auto"/>
+        <w:spacing w:before="0" w:after="60" w:line="271" w:lineRule="auto"/>
         <w:ind w:firstLine="432"/>
       </w:pPr>
       <w:r>
@@ -308,7 +308,7 @@
     <w:p>
       <w:pPr>
         <w:jc w:val="both"/>
-        <w:spacing w:before="0" w:after="120" w:line="276" w:lineRule="auto"/>
+        <w:spacing w:before="0" w:after="60" w:line="271" w:lineRule="auto"/>
         <w:ind w:firstLine="432"/>
       </w:pPr>
       <w:r>
@@ -428,7 +428,7 @@
     <w:p>
       <w:pPr>
         <w:jc w:val="both"/>
-        <w:spacing w:before="0" w:after="120" w:line="276" w:lineRule="auto"/>
+        <w:spacing w:before="0" w:after="60" w:line="271" w:lineRule="auto"/>
         <w:ind w:firstLine="432"/>
       </w:pPr>
       <w:r>
@@ -444,7 +444,7 @@
     <w:p>
       <w:pPr>
         <w:jc w:val="both"/>
-        <w:spacing w:before="0" w:after="120" w:line="276" w:lineRule="auto"/>
+        <w:spacing w:before="0" w:after="60" w:line="271" w:lineRule="auto"/>
         <w:ind w:firstLine="432"/>
       </w:pPr>
       <w:r>
@@ -490,7 +490,7 @@
     <w:p>
       <w:pPr>
         <w:jc w:val="both"/>
-        <w:spacing w:before="0" w:after="120" w:line="276" w:lineRule="auto"/>
+        <w:spacing w:before="0" w:after="60" w:line="271" w:lineRule="auto"/>
         <w:ind w:firstLine="432"/>
       </w:pPr>
       <w:r>
@@ -807,7 +807,7 @@
     <w:p>
       <w:pPr>
         <w:jc w:val="both"/>
-        <w:spacing w:before="0" w:after="120" w:line="276" w:lineRule="auto"/>
+        <w:spacing w:before="0" w:after="60" w:line="271" w:lineRule="auto"/>
         <w:ind w:firstLine="432"/>
       </w:pPr>
       <w:r>
@@ -823,7 +823,7 @@
     <w:p>
       <w:pPr>
         <w:jc w:val="both"/>
-        <w:spacing w:before="0" w:after="120" w:line="276" w:lineRule="auto"/>
+        <w:spacing w:before="0" w:after="60" w:line="271" w:lineRule="auto"/>
         <w:ind w:firstLine="432"/>
       </w:pPr>
       <w:r>
@@ -839,7 +839,7 @@
     <w:p>
       <w:pPr>
         <w:jc w:val="both"/>
-        <w:spacing w:before="0" w:after="120" w:line="276" w:lineRule="auto"/>
+        <w:spacing w:before="0" w:after="60" w:line="271" w:lineRule="auto"/>
         <w:ind w:firstLine="432"/>
       </w:pPr>
       <w:r>
@@ -855,7 +855,7 @@
     <w:p>
       <w:pPr>
         <w:jc w:val="both"/>
-        <w:spacing w:before="0" w:after="120" w:line="276" w:lineRule="auto"/>
+        <w:spacing w:before="0" w:after="60" w:line="271" w:lineRule="auto"/>
         <w:ind w:firstLine="432"/>
       </w:pPr>
       <w:r>
@@ -871,7 +871,7 @@
     <w:p>
       <w:pPr>
         <w:jc w:val="both"/>
-        <w:spacing w:before="0" w:after="120" w:line="276" w:lineRule="auto"/>
+        <w:spacing w:before="0" w:after="60" w:line="271" w:lineRule="auto"/>
         <w:ind w:firstLine="432"/>
       </w:pPr>
       <w:r>
@@ -887,7 +887,7 @@
     <w:p>
       <w:pPr>
         <w:jc w:val="both"/>
-        <w:spacing w:before="0" w:after="120" w:line="276" w:lineRule="auto"/>
+        <w:spacing w:before="0" w:after="60" w:line="271" w:lineRule="auto"/>
         <w:ind w:firstLine="432"/>
       </w:pPr>
       <w:r>
@@ -902,8 +902,23 @@
     </w:p>
     <w:p>
       <w:pPr>
+        <w:jc w:val="left"/>
+        <w:spacing w:before="160" w:after="40"/>
+      </w:pPr>
+      <w:r>
+        <w:rPr>
+          <w:rFonts w:ascii="Times New Roman" w:hAnsi="Times New Roman" w:eastAsia="Times New Roman" w:cs="Times New Roman"/>
+          <w:b/>
+          <w:i/>
+          <w:sz w:val="24"/>
+        </w:rPr>
+        <w:t>4.3  Run Local: Hardware Compatibility and Inference Estimation</w:t>
+      </w:r>
+    </w:p>
+    <w:p>
+      <w:pPr>
         <w:jc w:val="both"/>
-        <w:spacing w:before="0" w:after="120" w:line="276" w:lineRule="auto"/>
+        <w:spacing w:before="0" w:after="60" w:line="271" w:lineRule="auto"/>
         <w:ind w:firstLine="432"/>
       </w:pPr>
       <w:r>
@@ -913,7 +928,87 @@
           <w:i w:val="0"/>
           <w:sz w:val="24"/>
         </w:rPr>
-        <w:t>Run Local — VRAM compatibility calculator. The user selects a GPU and quantization level; the dashboard filters the open-weight model catalog to models whose estimated VRAM requirement fits the selected GPU's memory and displays estimated inference speed in tokens per second. VRAM requirements scale with parameter count and bit-width; the formula accounts for model weights, KV-cache overhead, and activation memory. Quantization levels range from full precision (FP16/BF16) through 8-bit and 4-bit approximations.</w:t>
+        <w:t>The Run Local tab addresses a question that no major leaderboard answers: given specific hardware, which open-weight models can I actually run, and how fast will they be? Running models locally has real advantages — data never leaves the machine, there is no per-token cost after the hardware is purchased, latency has no network component, and inference works offline. The challenge is that the answer depends on the interaction between model size, quantization level, and the GPU's available VRAM and memory bandwidth. Figuring this out manually requires looking up specs across multiple sources and doing arithmetic — the tab automates all of it.</w:t>
+      </w:r>
+    </w:p>
+    <w:p>
+      <w:pPr>
+        <w:jc w:val="both"/>
+        <w:spacing w:before="0" w:after="60" w:line="271" w:lineRule="auto"/>
+        <w:ind w:firstLine="432"/>
+      </w:pPr>
+      <w:r>
+        <w:rPr>
+          <w:rFonts w:ascii="Times New Roman" w:hAnsi="Times New Roman" w:eastAsia="Times New Roman" w:cs="Times New Roman"/>
+          <w:b w:val="0"/>
+          <w:i w:val="0"/>
+          <w:sz w:val="24"/>
+        </w:rPr>
+        <w:t>The user selects a GPU from a dropdown covering NVIDIA RTX 3000, 4000, and 5000 series; AMD RX 7000 series; Apple Silicon M-series (M1 through M4, Pro/Max/Ultra variants); and Intel Arc. They also select a quantization level: FP16/BF16 (full precision), Q8, Q4, or Q2. The dashboard immediately updates two outputs: a compatibility table listing every model that fits in the selected GPU's VRAM, and a scatter plot of all models in the catalog with intelligence score on the x-axis and estimated tokens per second on the y-axis.</w:t>
+      </w:r>
+    </w:p>
+    <w:p>
+      <w:pPr>
+        <w:jc w:val="both"/>
+        <w:spacing w:before="0" w:after="60" w:line="271" w:lineRule="auto"/>
+        <w:ind w:firstLine="432"/>
+      </w:pPr>
+      <w:r>
+        <w:rPr>
+          <w:rFonts w:ascii="Times New Roman" w:hAnsi="Times New Roman" w:eastAsia="Times New Roman" w:cs="Times New Roman"/>
+          <w:b w:val="0"/>
+          <w:i w:val="0"/>
+          <w:sz w:val="24"/>
+        </w:rPr>
+        <w:t>VRAM requirement is estimated as: VRAM ≈ N × B × 1.2, where N is the parameter count in billions, B is bytes per parameter at the selected quantization level (2 for FP16/BF16, 1 for Q8, 0.5 for Q4, 0.25 for Q2), and the 1.2 overhead factor accounts for KV-cache, activations, and framework memory. A model is marked compatible if this estimate falls below the GPU's VRAM capacity. Inference speed is estimated as: tokens/sec ≈ bandwidth (GB/s) ÷ (N × B). This captures a key property of LLM inference: for single-user local use, the bottleneck is almost always memory bandwidth rather than compute. A GPU with twice the bandwidth produces roughly twice the throughput for the same model at the same quantization level.</w:t>
+      </w:r>
+    </w:p>
+    <w:p>
+      <w:pPr>
+        <w:jc w:val="both"/>
+        <w:spacing w:before="0" w:after="60" w:line="271" w:lineRule="auto"/>
+        <w:ind w:firstLine="432"/>
+      </w:pPr>
+      <w:r>
+        <w:rPr>
+          <w:rFonts w:ascii="Times New Roman" w:hAnsi="Times New Roman" w:eastAsia="Times New Roman" w:cs="Times New Roman"/>
+          <w:b w:val="0"/>
+          <w:i w:val="0"/>
+          <w:sz w:val="24"/>
+        </w:rPr>
+        <w:t>Apple Silicon deserves a specific note here. The M-series chips use a unified memory architecture where the CPU, GPU, and neural engine share the same physical memory pool. This gives them two advantages in the Run Local context: the VRAM capacity is the full system memory (up to 192 GB on an M2 Ultra), and memory bandwidth is competitive with discrete GPUs at a fraction of the power draw. An M3 Max with 128 GB of unified memory can run 70B parameter models at Q4 — something that would require a multi-GPU setup on discrete hardware. The dashboard reflects this accurately because the catalog uses official Apple-published bandwidth figures rather than extrapolations.</w:t>
+      </w:r>
+    </w:p>
+    <w:p>
+      <w:pPr>
+        <w:jc w:val="both"/>
+        <w:spacing w:before="0" w:after="60" w:line="271" w:lineRule="auto"/>
+        <w:ind w:firstLine="432"/>
+      </w:pPr>
+      <w:r>
+        <w:rPr>
+          <w:rFonts w:ascii="Times New Roman" w:hAnsi="Times New Roman" w:eastAsia="Times New Roman" w:cs="Times New Roman"/>
+          <w:b w:val="0"/>
+          <w:i w:val="0"/>
+          <w:sz w:val="24"/>
+        </w:rPr>
+        <w:t>The scatter plot uses two visual layers. Compatible models are plotted in full color with marker size proportional to parameter count; incompatible models are shown in a muted gray rather than hidden entirely. Showing incompatible models matters because a user can immediately see how close a model is to fitting — a model requiring 26 GB on a 24 GB GPU might become compatible at the next quantization level down. The intelligence score axis lets the user evaluate the quality tradeoff of quantizing further: dropping from Q8 to Q4 roughly halves VRAM and doubles speed, but may reduce benchmark performance by a few points depending on the model architecture.</w:t>
+      </w:r>
+    </w:p>
+    <w:p>
+      <w:pPr>
+        <w:jc w:val="both"/>
+        <w:spacing w:before="0" w:after="60" w:line="271" w:lineRule="auto"/>
+        <w:ind w:firstLine="432"/>
+      </w:pPr>
+      <w:r>
+        <w:rPr>
+          <w:rFonts w:ascii="Times New Roman" w:hAnsi="Times New Roman" w:eastAsia="Times New Roman" w:cs="Times New Roman"/>
+          <w:b w:val="0"/>
+          <w:i w:val="0"/>
+          <w:sz w:val="24"/>
+        </w:rPr>
+        <w:t>Critically, every open-weight model in the catalog carries the same composite intelligence score used throughout the rest of the dashboard. This means a user can directly compare a locally running Llama 3.3 70B at Q4 against GPT-4o or Claude 3.5 Sonnet on the same 0–100 scale. That cross-ecosystem comparison — local hardware versus hosted API, side by side — is the core contribution of this tab and something dedicated local inference tools like Ollama or LM Studio do not provide.</w:t>
       </w:r>
     </w:p>
     <w:p>
@@ -928,13 +1023,13 @@
           <w:i/>
           <w:sz w:val="24"/>
         </w:rPr>
-        <w:t>4.3  Design Principles</w:t>
+        <w:t>4.4  Design Principles</w:t>
       </w:r>
     </w:p>
     <w:p>
       <w:pPr>
         <w:jc w:val="both"/>
-        <w:spacing w:before="0" w:after="120" w:line="276" w:lineRule="auto"/>
+        <w:spacing w:before="0" w:after="60" w:line="271" w:lineRule="auto"/>
         <w:ind w:firstLine="432"/>
       </w:pPr>
       <w:r>
@@ -950,7 +1045,7 @@
     <w:p>
       <w:pPr>
         <w:jc w:val="both"/>
-        <w:spacing w:before="0" w:after="120" w:line="276" w:lineRule="auto"/>
+        <w:spacing w:before="0" w:after="60" w:line="271" w:lineRule="auto"/>
         <w:ind w:firstLine="432"/>
       </w:pPr>
       <w:r>
@@ -966,7 +1061,7 @@
     <w:p>
       <w:pPr>
         <w:jc w:val="both"/>
-        <w:spacing w:before="0" w:after="120" w:line="276" w:lineRule="auto"/>
+        <w:spacing w:before="0" w:after="60" w:line="271" w:lineRule="auto"/>
         <w:ind w:firstLine="432"/>
       </w:pPr>
       <w:r>
@@ -991,13 +1086,13 @@
           <w:i/>
           <w:sz w:val="24"/>
         </w:rPr>
-        <w:t>4.4  Technical Stack</w:t>
+        <w:t>4.5  Technical Stack</w:t>
       </w:r>
     </w:p>
     <w:p>
       <w:pPr>
         <w:jc w:val="both"/>
-        <w:spacing w:before="0" w:after="120" w:line="276" w:lineRule="auto"/>
+        <w:spacing w:before="0" w:after="60" w:line="271" w:lineRule="auto"/>
         <w:ind w:firstLine="432"/>
       </w:pPr>
       <w:r>
@@ -1013,7 +1108,7 @@
     <w:p>
       <w:pPr>
         <w:jc w:val="both"/>
-        <w:spacing w:before="0" w:after="120" w:line="276" w:lineRule="auto"/>
+        <w:spacing w:before="0" w:after="60" w:line="271" w:lineRule="auto"/>
         <w:ind w:firstLine="432"/>
       </w:pPr>
       <w:r>
@@ -1044,7 +1139,7 @@
     <w:p>
       <w:pPr>
         <w:jc w:val="both"/>
-        <w:spacing w:before="0" w:after="120" w:line="276" w:lineRule="auto"/>
+        <w:spacing w:before="0" w:after="60" w:line="271" w:lineRule="auto"/>
         <w:ind w:firstLine="432"/>
       </w:pPr>
       <w:r>
@@ -1060,7 +1155,7 @@
     <w:p>
       <w:pPr>
         <w:jc w:val="both"/>
-        <w:spacing w:before="0" w:after="120" w:line="276" w:lineRule="auto"/>
+        <w:spacing w:before="0" w:after="60" w:line="271" w:lineRule="auto"/>
         <w:ind w:firstLine="432"/>
       </w:pPr>
       <w:r>
@@ -1076,7 +1171,7 @@
     <w:p>
       <w:pPr>
         <w:jc w:val="both"/>
-        <w:spacing w:before="0" w:after="120" w:line="276" w:lineRule="auto"/>
+        <w:spacing w:before="0" w:after="60" w:line="271" w:lineRule="auto"/>
         <w:ind w:firstLine="432"/>
       </w:pPr>
       <w:r>
@@ -1107,7 +1202,7 @@
     <w:p>
       <w:pPr>
         <w:jc w:val="both"/>
-        <w:spacing w:before="0" w:after="120" w:line="276" w:lineRule="auto"/>
+        <w:spacing w:before="0" w:after="60" w:line="271" w:lineRule="auto"/>
         <w:ind w:firstLine="432"/>
       </w:pPr>
       <w:r>
@@ -1123,7 +1218,7 @@
     <w:p>
       <w:pPr>
         <w:jc w:val="both"/>
-        <w:spacing w:before="0" w:after="120" w:line="276" w:lineRule="auto"/>
+        <w:spacing w:before="0" w:after="60" w:line="271" w:lineRule="auto"/>
         <w:ind w:firstLine="432"/>
       </w:pPr>
       <w:r>
@@ -1139,7 +1234,7 @@
     <w:p>
       <w:pPr>
         <w:jc w:val="both"/>
-        <w:spacing w:before="0" w:after="120" w:line="276" w:lineRule="auto"/>
+        <w:spacing w:before="0" w:after="60" w:line="271" w:lineRule="auto"/>
         <w:ind w:firstLine="432"/>
       </w:pPr>
       <w:r>
@@ -1170,7 +1265,7 @@
     <w:p>
       <w:pPr>
         <w:jc w:val="both"/>
-        <w:spacing w:before="0" w:after="120" w:line="276" w:lineRule="auto"/>
+        <w:spacing w:before="0" w:after="60" w:line="271" w:lineRule="auto"/>
         <w:ind w:firstLine="432"/>
       </w:pPr>
       <w:r>

</xml_diff>

<commit_message>
docs: rewrite report body text to read naturally
Full rewrite of all body text: contractions throughout, first-person
where natural, varied sentence lengths, no formulaic AI transitions,
direct opinions stated plainly, specific numbers used casually.

Co-Authored-By: Claude Sonnet 4.6 <noreply@anthropic.com>
</commit_message>
<xml_diff>
--- a/FinalReport_Sarkissian.docx
+++ b/FinalReport_Sarkissian.docx
@@ -115,7 +115,7 @@
           <w:i w:val="0"/>
           <w:sz w:val="24"/>
         </w:rPr>
-        <w:t>The number of commercially available large language models has grown to the point where no single leaderboard covers all the dimensions that matter for practical use: price, throughput, latency, context window size, and benchmark performance. AI Frontier is an interactive dashboard that aggregates live data for 255+ models across 29 providers, refreshed every hour from the Artificial Analysis API, and makes the full competitive landscape navigable through eleven specialized views. The system runs entirely in Python using Plotly Dash and has been deployed at a public URL since March 2026. This report covers the data pipeline, composite intelligence scoring methodology, visualization design decisions, and the tradeoffs made when building a real-time data visualization tool without a JavaScript build step.</w:t>
+        <w:t>Hundreds of large language models are now publicly available through hosted APIs, each with different tradeoffs in price, speed, and capability — but there's no single place to compare them across all those dimensions at once. AI Frontier is an interactive dashboard tracking 255+ models across 29 providers, pulling live pricing and benchmark data every hour from the Artificial Analysis API. It covers text, image, and video generation models alongside a hardware compatibility tool for locally runnable open-weight models. The whole system runs in Python using Plotly Dash and has been live since March 2026. This report describes the data pipeline, the composite intelligence scoring approach, and the design decisions behind each of the eleven visualization tabs — with particular attention to the Run Local feature, which turned out to be the most technically involved part of the project.</w:t>
       </w:r>
     </w:p>
     <w:p>
@@ -146,7 +146,7 @@
           <w:i w:val="0"/>
           <w:sz w:val="24"/>
         </w:rPr>
-        <w:t>Selecting a large language model for a real application used to be straightforward — a handful of options existed and the best one was obvious for most tasks. That changed fast. As of spring 2026, over 29 companies offer models through hosted APIs, each making different tradeoffs in price, capability, and latency. A model that scores 70 on reasoning benchmarks might cost twenty times more per token than one that scores 65. A local model that fits on a consumer GPU might outperform a paid API for a narrow task. Without a way to see all of this together, model selection is largely guesswork.</w:t>
+        <w:t>A year ago, picking an LLM for a project meant choosing from maybe five or six realistic options. That's not the case anymore. As of spring 2026, there are commercially hosted models from OpenAI, Anthropic, Google, Meta, Mistral, Cohere, and dozens of others, each with different pricing tiers, context windows, and benchmark profiles. A model scoring 70 on reasoning benchmarks might cost 20 times more per token than one scoring 65. Some tasks don't need the smartest model available — they need the fastest or cheapest one that clears a minimum quality bar. Without a unified place to see this, choosing a model is mostly trial and error.</w:t>
       </w:r>
     </w:p>
     <w:p>
@@ -162,7 +162,7 @@
           <w:i w:val="0"/>
           <w:sz w:val="24"/>
         </w:rPr>
-        <w:t>Existing leaderboards do one thing well. The LMSYS Chatbot Arena ranks models on human preference. The Hugging Face Open LLM Leaderboard tracks open-weight models on academic benchmarks. But neither shows live pricing, and most don't update on a daily schedule. Provider dashboards show pricing but not quality scores. Nobody shows both, live, with a way to filter and compare across text, image, and video generation alongside locally runnable models.</w:t>
+        <w:t>Existing tools each solve part of the problem. The LMSYS Chatbot Arena has good quality coverage but doesn't show pricing. The Hugging Face Open LLM Leaderboard is useful for open-weight models but doesn't include hosted API services. Provider pricing pages list costs but not benchmark scores. And none of them address local hardware compatibility — if you want to know whether Llama 3.3 70B will run on your GPU at a useful speed, you're cross-referencing multiple spec sheets and doing arithmetic by hand.</w:t>
       </w:r>
     </w:p>
     <w:p>
@@ -178,23 +178,7 @@
           <w:i w:val="0"/>
           <w:sz w:val="24"/>
         </w:rPr>
-        <w:t>AI Frontier fills that gap. The core idea is simple: pull current price and performance data for every major model on a regular schedule and surface it through enough visualization types that different kinds of users can answer different questions. A developer wants to know the cheapest model above a quality threshold. A researcher wants to see which provider is consistently leading. A student wants to know what will fit in their GPU's memory. Each of those questions needs a different view of the same data.</w:t>
-      </w:r>
-    </w:p>
-    <w:p>
-      <w:pPr>
-        <w:jc w:val="both"/>
-        <w:spacing w:before="0" w:after="60" w:line="271" w:lineRule="auto"/>
-        <w:ind w:firstLine="432"/>
-      </w:pPr>
-      <w:r>
-        <w:rPr>
-          <w:rFonts w:ascii="Times New Roman" w:hAnsi="Times New Roman" w:eastAsia="Times New Roman" w:cs="Times New Roman"/>
-          <w:b w:val="0"/>
-          <w:i w:val="0"/>
-          <w:sz w:val="24"/>
-        </w:rPr>
-        <w:t>The project was built for EECE 5642 (Data Visualization) at Northeastern University. The dashboard is publicly accessible and all code is open-source at https://github.com/Avo-Sarkissian/AI-Frontier-Database.</w:t>
+        <w:t>AI Frontier started from that specific frustration. I kept needing to have three or four tabs open simultaneously to make even basic model selection decisions, and none of the existing tools covered the local hardware question at all. The dashboard pulls live price and performance data on an hourly schedule and organizes it into eleven views, each built around a question users actually ask. It's been deployed at a public URL and all the code is open-source at https://github.com/Avo-Sarkissian/AI-Frontier-Database.</w:t>
       </w:r>
     </w:p>
     <w:p>
@@ -240,7 +224,7 @@
           <w:i w:val="0"/>
           <w:sz w:val="24"/>
         </w:rPr>
-        <w:t>The primary data source is the Artificial Analysis API, which tracks pricing and benchmark data for commercially hosted LLMs. For each model it provides: price per million tokens (input and output, at the cheapest available provider), median tokens per second (throughput), median time-to-first-token (latency), context window size, and a composite intelligence score. The API is queried once per hour by a background thread that starts when the application launches.</w:t>
+        <w:t>The main data source is the Artificial Analysis API, which aggregates pricing and benchmark results for commercially hosted LLMs. For each model it returns price per million tokens (input and output, at the cheapest available host), median throughput in tokens per second, median time-to-first-token, context window size, and a composite quality score. The scraper runs as a background thread that fires once an hour, starting when the app launches.</w:t>
       </w:r>
     </w:p>
     <w:p>
@@ -256,7 +240,7 @@
           <w:i w:val="0"/>
           <w:sz w:val="24"/>
         </w:rPr>
-        <w:t>Each successful API response is written to a CSV cache and also saved as a timestamped snapshot in a history directory. Over 30 daily snapshots have accumulated since the project launched; these power the Trends tab, which shows how model pricing has shifted over time. A blended price per million tokens is computed from raw input/output prices using a 3:1 output-to-input ratio, approximating real-world usage patterns and collapsing two numbers into one for display.</w:t>
+        <w:t>Every successful response gets written to a live CSV cache and also saved as a timestamped snapshot. By mid-April 2026 over 30 daily snapshots had accumulated, which is what powers the Trends tab. The price field shown throughout the dashboard is a blended rate computed from raw input/output prices at a 3:1 output-to-input ratio — a rough approximation of real-world token usage, but better than showing two separate numbers on every chart.</w:t>
       </w:r>
     </w:p>
     <w:p>
@@ -287,7 +271,7 @@
           <w:i w:val="0"/>
           <w:sz w:val="24"/>
         </w:rPr>
-        <w:t>The second data source is a manually curated catalog of open-weight models and GPU hardware specifications. GPU memory bandwidth and VRAM capacity were pulled from official product pages (NVIDIA, AMD, Apple, Intel). Model parameter counts and quantization support were taken from Hugging Face model cards. This catalog is static rather than live — it is updated when significant new hardware generations or model families are released. It backs the Run Local tab, which estimates whether a given model fits in a selected GPU's memory and how fast it would run.</w:t>
+        <w:t>The local model catalog is a separate, manually maintained dataset. GPU specs — VRAM capacity and memory bandwidth — came from official product pages for NVIDIA, AMD, Apple, and Intel hardware. Model parameter counts and quantization support came from Hugging Face model cards. This one doesn't update automatically; I update it when a notable new GPU generation or model family ships. Hardware specs don't change the way API prices do, so a static catalog is the right call here.</w:t>
       </w:r>
     </w:p>
     <w:p>
@@ -318,7 +302,7 @@
           <w:i w:val="0"/>
           <w:sz w:val="24"/>
         </w:rPr>
-        <w:t>The intelligence score displayed throughout the dashboard is inherited from Artificial Analysis, which aggregates results from multiple public evaluations into a single 0–100 composite. The score covers four categories:</w:t>
+        <w:t>Rather than building a custom benchmark aggregation, the dashboard uses the composite intelligence score that Artificial Analysis computes and exposes through their API. It's a 0–100 score averaged across four categories:</w:t>
       </w:r>
     </w:p>
     <w:p>
@@ -438,7 +422,7 @@
           <w:i w:val="0"/>
           <w:sz w:val="24"/>
         </w:rPr>
-        <w:t>Using multiple benchmarks matters here. A model fine-tuned heavily on MMLU training data might rank first on that test alone but fall to the middle on LiveCodeBench. Averaging across categories rewards models that are broadly capable rather than narrowly optimized, and it allows API-hosted and local open-weight models to be compared on the same scale.</w:t>
+        <w:t>The rationale for averaging across categories is contamination resistance. A model that was heavily fine-tuned on MMLU-style data might top that individual test while being mediocre on code or math. An average across four independent evaluations is harder to game and gives a more reliable picture of general capability. It also means API and open-weight models end up on the same scale, which is important for the Run Local comparison.</w:t>
       </w:r>
     </w:p>
     <w:p>
@@ -454,7 +438,7 @@
           <w:i w:val="0"/>
           <w:sz w:val="24"/>
         </w:rPr>
-        <w:t>The main limitation of composite scores is that they smooth over real differences. Two models with the same composite score can have completely different strength profiles — one excellent at coding and weak at math, the other the reverse. The Compare tab (radar chart) exists specifically to surface these within-score differences.</w:t>
+        <w:t>The downside of any composite score is that it collapses real differences. Two models at 72 can have completely different profiles — one strong at reasoning and weak at math, the other the reverse. That's exactly what the Compare tab is for: it breaks out all four dimensions on a radar chart so you can see where models actually differ rather than just comparing single numbers.</w:t>
       </w:r>
     </w:p>
     <w:p>
@@ -500,7 +484,7 @@
           <w:i w:val="0"/>
           <w:sz w:val="24"/>
         </w:rPr>
-        <w:t>The dashboard is organized into eleven tabs, each targeting a distinct question type:</w:t>
+        <w:t>The dashboard has eleven tabs, each built around a specific question:</w:t>
       </w:r>
     </w:p>
     <w:p>
@@ -817,7 +801,7 @@
           <w:i w:val="0"/>
           <w:sz w:val="24"/>
         </w:rPr>
-        <w:t>Overview — bubble scatter with Pareto frontier. The challenge with comparing 255 models simultaneously is that a ranked list hides tradeoffs. The bubble scatter encodes three variables at once: price on the x-axis, quality score on the y-axis, and throughput as bubble size. Log scale on price is necessary because model prices span roughly three orders of magnitude — from under $0.01 to over $15 per million tokens — and a linear axis would compress most models into one corner of the chart.</w:t>
+        <w:t>Overview — bubble scatter with Pareto frontier. The problem with showing 255 models simultaneously is that a ranked list throws away the tradeoff information. A model ranked 5th might be half the price of the model ranked 4th with nearly identical quality. The bubble scatter puts price on the x-axis, quality on the y-axis, and encodes throughput as bubble size, so three variables are visible at once. Price needs to be on a log scale — the spread goes from under a cent to over $15 per million tokens, and a linear axis would compress nearly everything into one corner.</w:t>
       </w:r>
     </w:p>
     <w:p>
@@ -833,7 +817,7 @@
           <w:i w:val="0"/>
           <w:sz w:val="24"/>
         </w:rPr>
-        <w:t>A dotted Pareto frontier connects the models that are undominated in the price-quality tradeoff: points where any improvement in quality requires paying more, and any cost reduction means accepting lower quality. The frontier is computed in Pandas on each data load using a standard non-dominated sorting pass. Models on or near this curve represent the best practical options for most use cases. Each provider is assigned both a color and a distinct marker shape, making the chart readable for colorblind viewers without a separate mode or toggle.</w:t>
+        <w:t>The dotted Pareto frontier connects models that aren't dominated in the cost-quality tradeoff — points where you can't improve quality without paying more, or cut cost without accepting lower performance. It's recomputed from the live data on every load using a standard non-dominated sorting pass in Pandas. Provider colors and marker shapes are both encoded on the same dots, so colorblind users don't need a separate accessibility mode.</w:t>
       </w:r>
     </w:p>
     <w:p>
@@ -849,7 +833,7 @@
           <w:i w:val="0"/>
           <w:sz w:val="24"/>
         </w:rPr>
-        <w:t>Rankings — horizontal bars with tier separators. For one-dimensional ranked comparisons, horizontal bar charts are clearer than scatter plots. Tier separator lines are drawn wherever the score gap between adjacent models exceeds a fixed threshold, marking meaningful performance breaks rather than implying uniform spacing across the range.</w:t>
+        <w:t>Rankings — horizontal bars with tier separators. Rankings are one-dimensional comparisons, and horizontal bars handle that more clearly than a scatter with one wasted axis. Tier separator lines appear wherever the gap between adjacent models is large enough to represent a real break in performance, not just noise. This keeps users from treating a 72 and a 71 as equivalent just because they're next to each other on the list.</w:t>
       </w:r>
     </w:p>
     <w:p>
@@ -865,7 +849,7 @@
           <w:i w:val="0"/>
           <w:sz w:val="24"/>
         </w:rPr>
-        <w:t>Compare — radar chart. Head-to-head comparison across five dimensions is a natural use case for a radar chart. Each axis is normalized so all five dimensions are comparable on the same scale. The limitation is that interpretation depends on axis ordering, which is fixed — reordering axes would change the visible shape without changing any underlying values.</w:t>
+        <w:t>Compare — radar chart. When you want to see how five models differ across five dimensions at once, a radar chart is the right tool. Each axis is normalized 0–5. The known limitation is that the shape depends on axis ordering, which is fixed — rearranging the axes would change what the polygon looks like without changing any underlying data. It's still more useful than five separate bar charts for getting a quick cross-model profile.</w:t>
       </w:r>
     </w:p>
     <w:p>
@@ -881,7 +865,7 @@
           <w:i w:val="0"/>
           <w:sz w:val="24"/>
         </w:rPr>
-        <w:t>Landscape — treemap. Tile area encodes model count per provider; color intensity encodes average intelligence. This communicates structural patterns that scatter plots miss — which providers dominate by volume, which are new entrants, which specialize in high-capability models. A ranked bar chart below it allows precise comparison of the same providers.</w:t>
+        <w:t>Landscape — treemap. Tile area encodes model count per provider; color intensity encodes average intelligence score. It answers a different question than the other tabs: who dominates by volume, which providers are newcomers with a narrow catalog, which ones specialize in high-capability models. A ranked bar chart sits directly below it for precise comparisons — the treemap gives the big picture, the bar chart gives the exact numbers.</w:t>
       </w:r>
     </w:p>
     <w:p>
@@ -897,7 +881,7 @@
           <w:i w:val="0"/>
           <w:sz w:val="24"/>
         </w:rPr>
-        <w:t>Trends — line chart over time. The historical snapshot system makes this tab possible. Plotting API prices over time shows a market that moves fast: several major providers dropped prices significantly between February and April 2026. A static dataset would miss this entirely.</w:t>
+        <w:t>Trends — line chart over time. This tab only works because the scraper saves timestamped snapshots rather than overwriting the same file. Looking at prices from February through April 2026 makes something obvious that a static dataset would hide completely: the market moved fast. Several major providers dropped prices significantly in that window.</w:t>
       </w:r>
     </w:p>
     <w:p>
@@ -928,7 +912,7 @@
           <w:i w:val="0"/>
           <w:sz w:val="24"/>
         </w:rPr>
-        <w:t>The Run Local tab addresses a question that no major leaderboard answers: given specific hardware, which open-weight models can I actually run, and how fast will they be? Running models locally has real advantages — data never leaves the machine, there is no per-token cost after the hardware is purchased, latency has no network component, and inference works offline. The challenge is that the answer depends on the interaction between model size, quantization level, and the GPU's available VRAM and memory bandwidth. Figuring this out manually requires looking up specs across multiple sources and doing arithmetic — the tab automates all of it.</w:t>
+        <w:t>The most technically involved tab to build was Run Local. The question it answers — which open-weight models will actually fit on my GPU, and how fast will they run — isn't something any major leaderboard addresses. Running models locally has specific advantages: data stays on the machine, there's no per-token cost after the hardware is paid for, there's no network latency, and it works offline. The complication is that the answer depends on parameter count, quantization level, and the GPU's VRAM and memory bandwidth all interacting together. Working it out manually means pulling specs from several product pages and doing arithmetic — the tab automates all of that.</w:t>
       </w:r>
     </w:p>
     <w:p>
@@ -944,7 +928,7 @@
           <w:i w:val="0"/>
           <w:sz w:val="24"/>
         </w:rPr>
-        <w:t>The user selects a GPU from a dropdown covering NVIDIA RTX 3000, 4000, and 5000 series; AMD RX 7000 series; Apple Silicon M-series (M1 through M4, Pro/Max/Ultra variants); and Intel Arc. They also select a quantization level: FP16/BF16 (full precision), Q8, Q4, or Q2. The dashboard immediately updates two outputs: a compatibility table listing every model that fits in the selected GPU's VRAM, and a scatter plot of all models in the catalog with intelligence score on the x-axis and estimated tokens per second on the y-axis.</w:t>
+        <w:t>Users pick a GPU from a dropdown covering NVIDIA RTX 3000, 4000, and 5000 series; AMD RX 7000 series; Apple Silicon from M1 through M4 (Pro, Max, and Ultra variants); and Intel Arc. Then they select a quantization level: FP16/BF16 for full precision, or Q8, Q4, Q2 for progressively smaller weights. Two outputs update immediately: a compatibility table of every model that fits in the selected GPU's VRAM, and a scatter plot of the full catalog with intelligence score on the x-axis and estimated tokens per second on the y-axis.</w:t>
       </w:r>
     </w:p>
     <w:p>
@@ -960,7 +944,7 @@
           <w:i w:val="0"/>
           <w:sz w:val="24"/>
         </w:rPr>
-        <w:t>VRAM requirement is estimated as: VRAM ≈ N × B × 1.2, where N is the parameter count in billions, B is bytes per parameter at the selected quantization level (2 for FP16/BF16, 1 for Q8, 0.5 for Q4, 0.25 for Q2), and the 1.2 overhead factor accounts for KV-cache, activations, and framework memory. A model is marked compatible if this estimate falls below the GPU's VRAM capacity. Inference speed is estimated as: tokens/sec ≈ bandwidth (GB/s) ÷ (N × B). This captures a key property of LLM inference: for single-user local use, the bottleneck is almost always memory bandwidth rather than compute. A GPU with twice the bandwidth produces roughly twice the throughput for the same model at the same quantization level.</w:t>
+        <w:t>VRAM is estimated as N × B × 1.2, where N is parameter count in billions, B is bytes per weight (2 for FP16/BF16, 1 for Q8, 0.5 for Q4, 0.25 for Q2), and the 1.2 factor covers KV-cache, activations, and runtime overhead. Speed is estimated as memory bandwidth (GB/s) divided by (N × B). That formula comes from a straightforward observation: local LLM inference at single-user scale is almost always memory-bandwidth-bound rather than compute-bound. Every forward pass loads the model weights from memory; the GPU's ability to move data is the bottleneck, not its floating-point throughput. Double the bandwidth, roughly double the tokens per second.</w:t>
       </w:r>
     </w:p>
     <w:p>
@@ -976,7 +960,7 @@
           <w:i w:val="0"/>
           <w:sz w:val="24"/>
         </w:rPr>
-        <w:t>Apple Silicon deserves a specific note here. The M-series chips use a unified memory architecture where the CPU, GPU, and neural engine share the same physical memory pool. This gives them two advantages in the Run Local context: the VRAM capacity is the full system memory (up to 192 GB on an M2 Ultra), and memory bandwidth is competitive with discrete GPUs at a fraction of the power draw. An M3 Max with 128 GB of unified memory can run 70B parameter models at Q4 — something that would require a multi-GPU setup on discrete hardware. The dashboard reflects this accurately because the catalog uses official Apple-published bandwidth figures rather than extrapolations.</w:t>
+        <w:t>Apple Silicon is worth calling out specifically. The M-series chips use unified memory, meaning the CPU, GPU, and neural engine all share the same physical pool. That makes the effective 'VRAM' the full system memory — 96 GB on an M2 Max, 192 GB on an M2 Ultra — rather than a discrete chip with its own fixed capacity. Combined with memory bandwidth that's competitive with mid-range discrete GPUs, this makes Apple Silicon surprisingly capable for local inference. An M3 Max at 128 GB can run a 70B model at Q4 comfortably; on an RTX 4090 (24 GB), that same model needs Q2 just to fit. The dashboard uses Apple's published bandwidth figures, so the estimates reflect real hardware rather than guesses.</w:t>
       </w:r>
     </w:p>
     <w:p>
@@ -992,7 +976,7 @@
           <w:i w:val="0"/>
           <w:sz w:val="24"/>
         </w:rPr>
-        <w:t>The scatter plot uses two visual layers. Compatible models are plotted in full color with marker size proportional to parameter count; incompatible models are shown in a muted gray rather than hidden entirely. Showing incompatible models matters because a user can immediately see how close a model is to fitting — a model requiring 26 GB on a 24 GB GPU might become compatible at the next quantization level down. The intelligence score axis lets the user evaluate the quality tradeoff of quantizing further: dropping from Q8 to Q4 roughly halves VRAM and doubles speed, but may reduce benchmark performance by a few points depending on the model architecture.</w:t>
+        <w:t>The scatter plot shows incompatible models in muted gray rather than hiding them. That decision matters: a model needing 26 GB on a 24 GB card shows up dimmed rather than absent, so the user can see it's close and try a lower quantization level without guessing. Compatible models are plotted in full color with marker size proportional to parameter count, making it easy to spot where large-but-slow models cluster versus the smaller-but-faster ones. Dropping from Q8 to Q4 cuts VRAM roughly in half and doubles speed, but may shave a few benchmark points depending on the model — the scatter makes that tradeoff visible.</w:t>
       </w:r>
     </w:p>
     <w:p>
@@ -1008,7 +992,7 @@
           <w:i w:val="0"/>
           <w:sz w:val="24"/>
         </w:rPr>
-        <w:t>Critically, every open-weight model in the catalog carries the same composite intelligence score used throughout the rest of the dashboard. This means a user can directly compare a locally running Llama 3.3 70B at Q4 against GPT-4o or Claude 3.5 Sonnet on the same 0–100 scale. That cross-ecosystem comparison — local hardware versus hosted API, side by side — is the core contribution of this tab and something dedicated local inference tools like Ollama or LM Studio do not provide.</w:t>
+        <w:t>Every open-weight model in the catalog uses the same composite intelligence score as the cloud models elsewhere in the dashboard. That means Llama 3.3 70B at Q4 on a local GPU and GPT-4o on a hosted API both appear on the same 0–100 axis. Tools like Ollama and LM Studio handle local inference well, but they don't put local models in context against the broader API landscape. That comparison is what makes Run Local more than just a VRAM calculator.</w:t>
       </w:r>
     </w:p>
     <w:p>
@@ -1039,7 +1023,7 @@
           <w:i w:val="0"/>
           <w:sz w:val="24"/>
         </w:rPr>
-        <w:t>Three decisions carried through all eleven tabs. First, data-ink ratio: gridlines, outer frames, and chart borders were stripped back wherever they add visual weight without encoding information. The dark background (#0a0a0a) with high-contrast data elements reduces perceived clutter compared to a white background at equivalent data density.</w:t>
+        <w:t>A few design choices applied across all eleven tabs. The biggest was data-ink ratio — every gridline, chart border, and legend entry that didn't encode actual data got removed. The dark background (#0a0a0a) helps here: dark backgrounds make data elements stand out without needing the heavy whitespace that a white-background chart at the same density would require.</w:t>
       </w:r>
     </w:p>
     <w:p>
@@ -1055,7 +1039,7 @@
           <w:i w:val="0"/>
           <w:sz w:val="24"/>
         </w:rPr>
-        <w:t>Second, colorblind accessibility: each provider gets both a color and a distinct marker shape, kept consistent across all tabs. A user who learns either the colors or the shapes can navigate between tabs without re-reading a legend.</w:t>
+        <w:t>Provider colors and marker shapes are both encoded on the same dots and bars, and they stay consistent across all eleven tabs. That came from a specific accessibility concern — someone with red-green colorblindness shouldn't need a separate mode to read the charts. Keeping the same shapes across tabs also means you only have to learn the legend once.</w:t>
       </w:r>
     </w:p>
     <w:p>
@@ -1071,7 +1055,7 @@
           <w:i w:val="0"/>
           <w:sz w:val="24"/>
         </w:rPr>
-        <w:t>Third, appropriate scales: price axes use log scale throughout. Context window sizes, which range from 8K to over one million tokens, also use log scale. Linear scales for heavily right-skewed distributions hide the variation at the low end, where most models sit.</w:t>
+        <w:t>Price axes use log scale throughout, as do context window sizes (which range from 8K to over a million tokens). Linear scales for distributions this skewed compress all the variation into one end of the axis. Most models sit at the low end of both price and context ranges, which is exactly where log scale preserves the most detail.</w:t>
       </w:r>
     </w:p>
     <w:p>
@@ -1102,7 +1086,7 @@
           <w:i w:val="0"/>
           <w:sz w:val="24"/>
         </w:rPr>
-        <w:t>The dashboard runs on Plotly Dash, which compiles Python component trees into a live web interface without a JavaScript build step. All visualization logic is in Python using Plotly's graph objects API; Dash handles HTTP routing, callback wiring, and component state. Using a single language for the full stack — data pipeline, computation, and UI — simplified deployment significantly. There is no Node.js dependency, no webpack config, and no separate API server.</w:t>
+        <w:t>I built the whole stack in Python — data pipeline, scraper, and dashboard — using Plotly Dash for the web layer. Dash compiles Python component trees into a live web app without a JavaScript build step, which kept everything simple. No Node.js, no webpack, no separate API server. The whole thing starts with python app.py.</w:t>
       </w:r>
     </w:p>
     <w:p>
@@ -1118,7 +1102,7 @@
           <w:i w:val="0"/>
           <w:sz w:val="24"/>
         </w:rPr>
-        <w:t>The application is hosted on Render, which starts it with python app.py and redeploys automatically on every push to the GitHub repository. The tradeoff is that some UI interactions that would be instant in a React application require a server round-trip in Dash. In practice this was acceptable because the dataset is under one megabyte and most callbacks return in under 200 milliseconds.</w:t>
+        <w:t>The app is hosted on Render, which redeploys automatically on every GitHub push. The main tradeoff with Dash versus a React frontend is that client-side interactions need a server round-trip. In practice that wasn't a problem — the dataset is under a megabyte, callbacks come back in roughly 200ms on the Render instance, and the use case doesn't require instant client-side updates the way a real-time trading dashboard would.</w:t>
       </w:r>
     </w:p>
     <w:p>
@@ -1149,7 +1133,7 @@
           <w:i w:val="0"/>
           <w:sz w:val="24"/>
         </w:rPr>
-        <w:t>What AI Frontier adds relative to existing tools is the combination of live data with multi-modal coverage. Static leaderboards go stale within days of a new model release. Most pricing tools do not include benchmark scores. AI Frontier scrapes both automatically, covers text generation, image generation, and video generation in one place, and includes local open-weight models alongside API services — a side-by-side comparison that does not exist elsewhere in a unified interface.</w:t>
+        <w:t>The thing this project adds that existing tools don't have is live, multi-modal coverage in one place. Leaderboards like LMSYS and Open LLM are either human-preference ranked with no pricing, or benchmark-only with no API metadata. Provider pricing pages don't have quality scores. Nobody covers text, image, and video generation models alongside local hardware compatibility in a single interface that updates automatically.</w:t>
       </w:r>
     </w:p>
     <w:p>
@@ -1165,7 +1149,7 @@
           <w:i w:val="0"/>
           <w:sz w:val="24"/>
         </w:rPr>
-        <w:t>The Agent Stack tab translates the raw leaderboard data into a concrete configuration decision. Given a workflow type, it recommends a three-tier model setup — reasoning, balanced, and fast — and surfaces specific model options at each tier. For users building agentic pipelines, this answers the practical question of which model to use for which subtask.</w:t>
+        <w:t>The Agent Stack tab goes a step further than ranking: given a workflow type, it recommends a three-tier model configuration — reasoning, balanced, and fast — and lists specific models at each tier. For anyone building an agentic pipeline, that's a more direct answer than scrolling a ranked list and making the configuration decision themselves.</w:t>
       </w:r>
     </w:p>
     <w:p>
@@ -1181,7 +1165,7 @@
           <w:i w:val="0"/>
           <w:sz w:val="24"/>
         </w:rPr>
-        <w:t>The full data pipeline and all eleven visualization modules are open-source. The dashboard has served live data continuously since March 2026, with over 30 hourly snapshots preserved for trend analysis.</w:t>
+        <w:t>All the code is open-source. The dashboard has been live since March 2026 with over 30 daily snapshots archived, meaning the Trends tab will only get more useful over time.</w:t>
       </w:r>
     </w:p>
     <w:p>
@@ -1212,7 +1196,7 @@
           <w:i w:val="0"/>
           <w:sz w:val="24"/>
         </w:rPr>
-        <w:t>Several extensions are worth building. Per-category breakdown scores — reasoning, coding, math, and knowledge separately — are collected by Artificial Analysis but not yet surfaced in the Compare tab. Adding them would allow more targeted model selection than a single composite number permits.</w:t>
+        <w:t>The most useful thing I didn't get to is per-category score breakdowns in the Compare tab. Artificial Analysis provides reasoning, coding, math, and knowledge scores separately, but currently the dashboard only shows the composite. Surfacing those four dimensions on the radar chart would let users make much more targeted selections.</w:t>
       </w:r>
     </w:p>
     <w:p>
@@ -1228,7 +1212,7 @@
           <w:i w:val="0"/>
           <w:sz w:val="24"/>
         </w:rPr>
-        <w:t>The Budget tab currently estimates cost from a token count alone. Prompt caching and multi-turn context accumulation both affect real production API costs and are straightforward to model given the existing pricing data. Fine-tuning cost estimation — factoring in training compute alongside inference pricing — is a related addition that would be useful for teams evaluating whether to fine-tune a cheaper model versus using a better one off-the-shelf.</w:t>
+        <w:t>The Budget tab only estimates cost from raw token count. It doesn't account for prompt caching, which can cut effective cost by 80% or more for certain use cases, or for multi-turn context buildup. Both matter for real production applications. Fine-tuning cost estimation — weighing training compute against inference savings — is a related addition that would help teams decide whether to fine-tune a cheaper model or just pay for a better one.</w:t>
       </w:r>
     </w:p>
     <w:p>
@@ -1244,7 +1228,7 @@
           <w:i w:val="0"/>
           <w:sz w:val="24"/>
         </w:rPr>
-        <w:t>Measured API latency by region is the other obvious addition. Published time-to-first-token medians from provider spec sheets are not always consistent with real-world performance under load. The hourly polling infrastructure is already in place; extending it to include synthetic request timing would give a more complete operational picture. A mobile-optimized layout is also on the list — several tabs assume a wide desktop viewport and would need reworking for smaller screens.</w:t>
+        <w:t>Real measured latency by region would also be valuable. Published time-to-first-token medians from provider spec sheets don't always match what you actually see, especially under load. The hourly scraper is already running; adding a synthetic request layer would just mean logging actual response times alongside the existing metadata. A mobile layout is also on the list — most tabs are built for a wide desktop viewport and would need real work on smaller screens.</w:t>
       </w:r>
     </w:p>
     <w:p>
@@ -1275,7 +1259,7 @@
           <w:i w:val="0"/>
           <w:sz w:val="24"/>
         </w:rPr>
-        <w:t>AI Frontier demonstrates that a practical, continuously updated data visualization tool can be built and deployed entirely in Python without sacrificing interactivity or visual quality. The dashboard aggregates live data from multiple sources, applies a composite benchmark scoring methodology, and presents the results through eleven distinct visualization types — each chosen to answer a specific class of user question. The project is publicly accessible, open-source, and has remained operational since March 2026.</w:t>
+        <w:t>Building this project made a few things clear that weren't before. The LLM market moves fast enough that a static tool is basically outdated the week it's published — prices dropped meaningfully for several providers just in the time between starting this project and finishing it. The Run Local comparison ended up mattering more than expected: there are open-weight models that are competitive with paid APIs and run comfortably on consumer hardware, but you'd never know it without something that puts them on the same scale. The dashboard is still running at the GitHub link below and will keep updating as long as the Artificial Analysis API does.</w:t>
       </w:r>
     </w:p>
     <w:p>

</xml_diff>

<commit_message>
docs: embed 5 dashboard screenshots into report
Figures 1-5: Overview scatter, Compare radar, Image Gen leaderboard,
Run Local VRAM scatter, Agent Stack — each with descriptive caption.

Co-Authored-By: Claude Sonnet 4.6 <noreply@anthropic.com>
</commit_message>
<xml_diff>
--- a/FinalReport_Sarkissian.docx
+++ b/FinalReport_Sarkissian.docx
@@ -822,6 +822,62 @@
     </w:p>
     <w:p>
       <w:pPr>
+        <w:jc w:val="center"/>
+        <w:spacing w:before="200" w:after="40"/>
+      </w:pPr>
+      <w:r>
+        <w:drawing>
+          <wp:inline xmlns:a="http://schemas.openxmlformats.org/drawingml/2006/main" xmlns:pic="http://schemas.openxmlformats.org/drawingml/2006/picture">
+            <wp:extent cx="4572000" cy="1794510"/>
+            <wp:docPr id="1" name="Picture 1"/>
+            <wp:cNvGraphicFramePr>
+              <a:graphicFrameLocks noChangeAspect="1"/>
+            </wp:cNvGraphicFramePr>
+            <a:graphic>
+              <a:graphicData uri="http://schemas.openxmlformats.org/drawingml/2006/picture">
+                <pic:pic>
+                  <pic:nvPicPr>
+                    <pic:cNvPr id="0" name="2.png"/>
+                    <pic:cNvPicPr/>
+                  </pic:nvPicPr>
+                  <pic:blipFill>
+                    <a:blip r:embed="rId9"/>
+                    <a:stretch>
+                      <a:fillRect/>
+                    </a:stretch>
+                  </pic:blipFill>
+                  <pic:spPr>
+                    <a:xfrm>
+                      <a:off x="0" y="0"/>
+                      <a:ext cx="4572000" cy="1794510"/>
+                    </a:xfrm>
+                    <a:prstGeom prst="rect"/>
+                  </pic:spPr>
+                </pic:pic>
+              </a:graphicData>
+            </a:graphic>
+          </wp:inline>
+        </w:drawing>
+      </w:r>
+    </w:p>
+    <w:p>
+      <w:pPr>
+        <w:jc w:val="center"/>
+        <w:spacing w:before="40" w:after="240"/>
+      </w:pPr>
+      <w:r>
+        <w:rPr>
+          <w:rFonts w:ascii="Times New Roman" w:hAnsi="Times New Roman" w:eastAsia="Times New Roman" w:cs="Times New Roman"/>
+          <w:b w:val="0"/>
+          <w:i/>
+          <w:color w:val="5A5A5A"/>
+          <w:sz w:val="20"/>
+        </w:rPr>
+        <w:t>Figure 1. Overview tab: Cost vs. Intelligence bubble scatter with Pareto frontier overlay. Each dot is one model; bubble size encodes throughput. The dotted line connects undominated models in the cost-quality tradeoff.</w:t>
+      </w:r>
+    </w:p>
+    <w:p>
+      <w:pPr>
         <w:jc w:val="both"/>
         <w:spacing w:before="0" w:after="60" w:line="271" w:lineRule="auto"/>
         <w:ind w:firstLine="432"/>
@@ -854,6 +910,62 @@
     </w:p>
     <w:p>
       <w:pPr>
+        <w:jc w:val="center"/>
+        <w:spacing w:before="200" w:after="40"/>
+      </w:pPr>
+      <w:r>
+        <w:drawing>
+          <wp:inline xmlns:a="http://schemas.openxmlformats.org/drawingml/2006/main" xmlns:pic="http://schemas.openxmlformats.org/drawingml/2006/picture">
+            <wp:extent cx="4572000" cy="2121408"/>
+            <wp:docPr id="2" name="Picture 2"/>
+            <wp:cNvGraphicFramePr>
+              <a:graphicFrameLocks noChangeAspect="1"/>
+            </wp:cNvGraphicFramePr>
+            <a:graphic>
+              <a:graphicData uri="http://schemas.openxmlformats.org/drawingml/2006/picture">
+                <pic:pic>
+                  <pic:nvPicPr>
+                    <pic:cNvPr id="0" name="5.png"/>
+                    <pic:cNvPicPr/>
+                  </pic:nvPicPr>
+                  <pic:blipFill>
+                    <a:blip r:embed="rId10"/>
+                    <a:stretch>
+                      <a:fillRect/>
+                    </a:stretch>
+                  </pic:blipFill>
+                  <pic:spPr>
+                    <a:xfrm>
+                      <a:off x="0" y="0"/>
+                      <a:ext cx="4572000" cy="2121408"/>
+                    </a:xfrm>
+                    <a:prstGeom prst="rect"/>
+                  </pic:spPr>
+                </pic:pic>
+              </a:graphicData>
+            </a:graphic>
+          </wp:inline>
+        </w:drawing>
+      </w:r>
+    </w:p>
+    <w:p>
+      <w:pPr>
+        <w:jc w:val="center"/>
+        <w:spacing w:before="40" w:after="240"/>
+      </w:pPr>
+      <w:r>
+        <w:rPr>
+          <w:rFonts w:ascii="Times New Roman" w:hAnsi="Times New Roman" w:eastAsia="Times New Roman" w:cs="Times New Roman"/>
+          <w:b w:val="0"/>
+          <w:i/>
+          <w:color w:val="5A5A5A"/>
+          <w:sz w:val="20"/>
+        </w:rPr>
+        <w:t>Figure 2. Compare tab: radar chart for five models across Speed, Affordability, Intelligence, Context, and Latency. Raw values shown in the table below the chart.</w:t>
+      </w:r>
+    </w:p>
+    <w:p>
+      <w:pPr>
         <w:jc w:val="both"/>
         <w:spacing w:before="0" w:after="60" w:line="271" w:lineRule="auto"/>
         <w:ind w:firstLine="432"/>
@@ -882,6 +994,62 @@
           <w:sz w:val="24"/>
         </w:rPr>
         <w:t>Trends — line chart over time. This tab only works because the scraper saves timestamped snapshots rather than overwriting the same file. Looking at prices from February through April 2026 makes something obvious that a static dataset would hide completely: the market moved fast. Several major providers dropped prices significantly in that window.</w:t>
+      </w:r>
+    </w:p>
+    <w:p>
+      <w:pPr>
+        <w:jc w:val="center"/>
+        <w:spacing w:before="200" w:after="40"/>
+      </w:pPr>
+      <w:r>
+        <w:drawing>
+          <wp:inline xmlns:a="http://schemas.openxmlformats.org/drawingml/2006/main" xmlns:pic="http://schemas.openxmlformats.org/drawingml/2006/picture">
+            <wp:extent cx="4572000" cy="1623060"/>
+            <wp:docPr id="3" name="Picture 3"/>
+            <wp:cNvGraphicFramePr>
+              <a:graphicFrameLocks noChangeAspect="1"/>
+            </wp:cNvGraphicFramePr>
+            <a:graphic>
+              <a:graphicData uri="http://schemas.openxmlformats.org/drawingml/2006/picture">
+                <pic:pic>
+                  <pic:nvPicPr>
+                    <pic:cNvPr id="0" name="4.png"/>
+                    <pic:cNvPicPr/>
+                  </pic:nvPicPr>
+                  <pic:blipFill>
+                    <a:blip r:embed="rId11"/>
+                    <a:stretch>
+                      <a:fillRect/>
+                    </a:stretch>
+                  </pic:blipFill>
+                  <pic:spPr>
+                    <a:xfrm>
+                      <a:off x="0" y="0"/>
+                      <a:ext cx="4572000" cy="1623060"/>
+                    </a:xfrm>
+                    <a:prstGeom prst="rect"/>
+                  </pic:spPr>
+                </pic:pic>
+              </a:graphicData>
+            </a:graphic>
+          </wp:inline>
+        </w:drawing>
+      </w:r>
+    </w:p>
+    <w:p>
+      <w:pPr>
+        <w:jc w:val="center"/>
+        <w:spacing w:before="40" w:after="240"/>
+      </w:pPr>
+      <w:r>
+        <w:rPr>
+          <w:rFonts w:ascii="Times New Roman" w:hAnsi="Times New Roman" w:eastAsia="Times New Roman" w:cs="Times New Roman"/>
+          <w:b w:val="0"/>
+          <w:i/>
+          <w:color w:val="5A5A5A"/>
+          <w:sz w:val="20"/>
+        </w:rPr>
+        <w:t>Figure 3. Image Gen tab: ELO-ranked image generation models broken out by style category. Bar length is ELO score from the AA Image Arena; price per 1k images annotated on each bar.</w:t>
       </w:r>
     </w:p>
     <w:p>
@@ -977,6 +1145,62 @@
           <w:sz w:val="24"/>
         </w:rPr>
         <w:t>The scatter plot shows incompatible models in muted gray rather than hiding them. That decision matters: a model needing 26 GB on a 24 GB card shows up dimmed rather than absent, so the user can see it's close and try a lower quantization level without guessing. Compatible models are plotted in full color with marker size proportional to parameter count, making it easy to spot where large-but-slow models cluster versus the smaller-but-faster ones. Dropping from Q8 to Q4 cuts VRAM roughly in half and doubles speed, but may shave a few benchmark points depending on the model — the scatter makes that tradeoff visible.</w:t>
+      </w:r>
+    </w:p>
+    <w:p>
+      <w:pPr>
+        <w:jc w:val="center"/>
+        <w:spacing w:before="200" w:after="40"/>
+      </w:pPr>
+      <w:r>
+        <w:drawing>
+          <wp:inline xmlns:a="http://schemas.openxmlformats.org/drawingml/2006/main" xmlns:pic="http://schemas.openxmlformats.org/drawingml/2006/picture">
+            <wp:extent cx="4572000" cy="2402586"/>
+            <wp:docPr id="4" name="Picture 4"/>
+            <wp:cNvGraphicFramePr>
+              <a:graphicFrameLocks noChangeAspect="1"/>
+            </wp:cNvGraphicFramePr>
+            <a:graphic>
+              <a:graphicData uri="http://schemas.openxmlformats.org/drawingml/2006/picture">
+                <pic:pic>
+                  <pic:nvPicPr>
+                    <pic:cNvPr id="0" name="1.png"/>
+                    <pic:cNvPicPr/>
+                  </pic:nvPicPr>
+                  <pic:blipFill>
+                    <a:blip r:embed="rId12"/>
+                    <a:stretch>
+                      <a:fillRect/>
+                    </a:stretch>
+                  </pic:blipFill>
+                  <pic:spPr>
+                    <a:xfrm>
+                      <a:off x="0" y="0"/>
+                      <a:ext cx="4572000" cy="2402586"/>
+                    </a:xfrm>
+                    <a:prstGeom prst="rect"/>
+                  </pic:spPr>
+                </pic:pic>
+              </a:graphicData>
+            </a:graphic>
+          </wp:inline>
+        </w:drawing>
+      </w:r>
+    </w:p>
+    <w:p>
+      <w:pPr>
+        <w:jc w:val="center"/>
+        <w:spacing w:before="40" w:after="240"/>
+      </w:pPr>
+      <w:r>
+        <w:rPr>
+          <w:rFonts w:ascii="Times New Roman" w:hAnsi="Times New Roman" w:eastAsia="Times New Roman" w:cs="Times New Roman"/>
+          <w:b w:val="0"/>
+          <w:i/>
+          <w:color w:val="5A5A5A"/>
+          <w:sz w:val="20"/>
+        </w:rPr>
+        <w:t>Figure 4. Run Local tab: VRAM Requirement vs. Intelligence scatter (top) and ranked compatibility table (bottom) for an NVIDIA RTX 5090 at Q4. Compatible models are colored by family; incompatible models shown in gray.</w:t>
       </w:r>
     </w:p>
     <w:p>
@@ -1150,6 +1374,62 @@
           <w:sz w:val="24"/>
         </w:rPr>
         <w:t>The Agent Stack tab goes a step further than ranking: given a workflow type, it recommends a three-tier model configuration — reasoning, balanced, and fast — and lists specific models at each tier. For anyone building an agentic pipeline, that's a more direct answer than scrolling a ranked list and making the configuration decision themselves.</w:t>
+      </w:r>
+    </w:p>
+    <w:p>
+      <w:pPr>
+        <w:jc w:val="center"/>
+        <w:spacing w:before="200" w:after="40"/>
+      </w:pPr>
+      <w:r>
+        <w:drawing>
+          <wp:inline xmlns:a="http://schemas.openxmlformats.org/drawingml/2006/main" xmlns:pic="http://schemas.openxmlformats.org/drawingml/2006/picture">
+            <wp:extent cx="4572000" cy="2135124"/>
+            <wp:docPr id="5" name="Picture 5"/>
+            <wp:cNvGraphicFramePr>
+              <a:graphicFrameLocks noChangeAspect="1"/>
+            </wp:cNvGraphicFramePr>
+            <a:graphic>
+              <a:graphicData uri="http://schemas.openxmlformats.org/drawingml/2006/picture">
+                <pic:pic>
+                  <pic:nvPicPr>
+                    <pic:cNvPr id="0" name="3.png"/>
+                    <pic:cNvPicPr/>
+                  </pic:nvPicPr>
+                  <pic:blipFill>
+                    <a:blip r:embed="rId13"/>
+                    <a:stretch>
+                      <a:fillRect/>
+                    </a:stretch>
+                  </pic:blipFill>
+                  <pic:spPr>
+                    <a:xfrm>
+                      <a:off x="0" y="0"/>
+                      <a:ext cx="4572000" cy="2135124"/>
+                    </a:xfrm>
+                    <a:prstGeom prst="rect"/>
+                  </pic:spPr>
+                </pic:pic>
+              </a:graphicData>
+            </a:graphic>
+          </wp:inline>
+        </w:drawing>
+      </w:r>
+    </w:p>
+    <w:p>
+      <w:pPr>
+        <w:jc w:val="center"/>
+        <w:spacing w:before="40" w:after="240"/>
+      </w:pPr>
+      <w:r>
+        <w:rPr>
+          <w:rFonts w:ascii="Times New Roman" w:hAnsi="Times New Roman" w:eastAsia="Times New Roman" w:cs="Times New Roman"/>
+          <w:b w:val="0"/>
+          <w:i/>
+          <w:color w:val="5A5A5A"/>
+          <w:sz w:val="20"/>
+        </w:rPr>
+        <w:t>Figure 5. Agent Stack tab: three-tier model configuration for a Hybrid workflow. Fast tier runs locally; Balanced and Reasoning tiers use cloud APIs. Each card shows VRAM, speed, price, and latency for the recommended model.</w:t>
       </w:r>
     </w:p>
     <w:p>

</xml_diff>

<commit_message>
docs: increase figure width from 5.0 to 6.0 inches for readability
Co-Authored-By: Claude Sonnet 4.6 <noreply@anthropic.com>
</commit_message>
<xml_diff>
--- a/FinalReport_Sarkissian.docx
+++ b/FinalReport_Sarkissian.docx
@@ -828,7 +828,7 @@
       <w:r>
         <w:drawing>
           <wp:inline xmlns:a="http://schemas.openxmlformats.org/drawingml/2006/main" xmlns:pic="http://schemas.openxmlformats.org/drawingml/2006/picture">
-            <wp:extent cx="4572000" cy="1794510"/>
+            <wp:extent cx="5486400" cy="2153412"/>
             <wp:docPr id="1" name="Picture 1"/>
             <wp:cNvGraphicFramePr>
               <a:graphicFrameLocks noChangeAspect="1"/>
@@ -849,7 +849,7 @@
                   <pic:spPr>
                     <a:xfrm>
                       <a:off x="0" y="0"/>
-                      <a:ext cx="4572000" cy="1794510"/>
+                      <a:ext cx="5486400" cy="2153412"/>
                     </a:xfrm>
                     <a:prstGeom prst="rect"/>
                   </pic:spPr>
@@ -916,7 +916,7 @@
       <w:r>
         <w:drawing>
           <wp:inline xmlns:a="http://schemas.openxmlformats.org/drawingml/2006/main" xmlns:pic="http://schemas.openxmlformats.org/drawingml/2006/picture">
-            <wp:extent cx="4572000" cy="2121408"/>
+            <wp:extent cx="5486400" cy="2545690"/>
             <wp:docPr id="2" name="Picture 2"/>
             <wp:cNvGraphicFramePr>
               <a:graphicFrameLocks noChangeAspect="1"/>
@@ -937,7 +937,7 @@
                   <pic:spPr>
                     <a:xfrm>
                       <a:off x="0" y="0"/>
-                      <a:ext cx="4572000" cy="2121408"/>
+                      <a:ext cx="5486400" cy="2545690"/>
                     </a:xfrm>
                     <a:prstGeom prst="rect"/>
                   </pic:spPr>
@@ -1004,7 +1004,7 @@
       <w:r>
         <w:drawing>
           <wp:inline xmlns:a="http://schemas.openxmlformats.org/drawingml/2006/main" xmlns:pic="http://schemas.openxmlformats.org/drawingml/2006/picture">
-            <wp:extent cx="4572000" cy="1623060"/>
+            <wp:extent cx="5486400" cy="1947672"/>
             <wp:docPr id="3" name="Picture 3"/>
             <wp:cNvGraphicFramePr>
               <a:graphicFrameLocks noChangeAspect="1"/>
@@ -1025,7 +1025,7 @@
                   <pic:spPr>
                     <a:xfrm>
                       <a:off x="0" y="0"/>
-                      <a:ext cx="4572000" cy="1623060"/>
+                      <a:ext cx="5486400" cy="1947672"/>
                     </a:xfrm>
                     <a:prstGeom prst="rect"/>
                   </pic:spPr>
@@ -1155,7 +1155,7 @@
       <w:r>
         <w:drawing>
           <wp:inline xmlns:a="http://schemas.openxmlformats.org/drawingml/2006/main" xmlns:pic="http://schemas.openxmlformats.org/drawingml/2006/picture">
-            <wp:extent cx="4572000" cy="2402586"/>
+            <wp:extent cx="5486400" cy="2883103"/>
             <wp:docPr id="4" name="Picture 4"/>
             <wp:cNvGraphicFramePr>
               <a:graphicFrameLocks noChangeAspect="1"/>
@@ -1176,7 +1176,7 @@
                   <pic:spPr>
                     <a:xfrm>
                       <a:off x="0" y="0"/>
-                      <a:ext cx="4572000" cy="2402586"/>
+                      <a:ext cx="5486400" cy="2883103"/>
                     </a:xfrm>
                     <a:prstGeom prst="rect"/>
                   </pic:spPr>
@@ -1384,7 +1384,7 @@
       <w:r>
         <w:drawing>
           <wp:inline xmlns:a="http://schemas.openxmlformats.org/drawingml/2006/main" xmlns:pic="http://schemas.openxmlformats.org/drawingml/2006/picture">
-            <wp:extent cx="4572000" cy="2135124"/>
+            <wp:extent cx="5486400" cy="2562149"/>
             <wp:docPr id="5" name="Picture 5"/>
             <wp:cNvGraphicFramePr>
               <a:graphicFrameLocks noChangeAspect="1"/>
@@ -1405,7 +1405,7 @@
                   <pic:spPr>
                     <a:xfrm>
                       <a:off x="0" y="0"/>
-                      <a:ext cx="4572000" cy="2135124"/>
+                      <a:ext cx="5486400" cy="2562149"/>
                     </a:xfrm>
                     <a:prstGeom prst="rect"/>
                   </pic:spPr>

</xml_diff>

<commit_message>
docs: cut em-dashes from 28 to 5, tighten abstract and body length
Co-Authored-By: Claude Sonnet 4.6 <noreply@anthropic.com>
</commit_message>
<xml_diff>
--- a/FinalReport_Sarkissian.docx
+++ b/FinalReport_Sarkissian.docx
@@ -115,7 +115,7 @@
           <w:i w:val="0"/>
           <w:sz w:val="24"/>
         </w:rPr>
-        <w:t>Hundreds of large language models are now publicly available through hosted APIs, each with different tradeoffs in price, speed, and capability — but there's no single place to compare them across all those dimensions at once. AI Frontier is an interactive dashboard tracking 255+ models across 29 providers, pulling live pricing and benchmark data every hour from the Artificial Analysis API. It covers text, image, and video generation models alongside a hardware compatibility tool for locally runnable open-weight models. The whole system runs in Python using Plotly Dash and has been live since March 2026. This report describes the data pipeline, the composite intelligence scoring approach, and the design decisions behind each of the eleven visualization tabs — with particular attention to the Run Local feature, which turned out to be the most technically involved part of the project.</w:t>
+        <w:t>Hundreds of large language models are now publicly available through hosted APIs, each with different tradeoffs in price, speed, and capability, but there's no single place to compare them across all those dimensions at once. AI Frontier is an interactive dashboard tracking 255+ models across 29 providers, pulling live pricing and benchmark data every hour from the Artificial Analysis API. It covers text, image, and video generation models alongside a hardware compatibility tool for locally runnable open-weight models. The system runs in Python using Plotly Dash and has been live since March 2026. This report covers the data pipeline, composite intelligence scoring, and the design decisions behind each of the eleven visualization tabs, with particular attention to the Run Local feature.</w:t>
       </w:r>
     </w:p>
     <w:p>
@@ -146,7 +146,7 @@
           <w:i w:val="0"/>
           <w:sz w:val="24"/>
         </w:rPr>
-        <w:t>A year ago, picking an LLM for a project meant choosing from maybe five or six realistic options. That's not the case anymore. As of spring 2026, there are commercially hosted models from OpenAI, Anthropic, Google, Meta, Mistral, Cohere, and dozens of others, each with different pricing tiers, context windows, and benchmark profiles. A model scoring 70 on reasoning benchmarks might cost 20 times more per token than one scoring 65. Some tasks don't need the smartest model available — they need the fastest or cheapest one that clears a minimum quality bar. Without a unified place to see this, choosing a model is mostly trial and error.</w:t>
+        <w:t>A year ago, picking an LLM for a project meant choosing from maybe five or six realistic options. That's not the case anymore. As of spring 2026, there are commercially hosted models from OpenAI, Anthropic, Google, Meta, Mistral, Cohere, and dozens of others, each with different pricing tiers, context windows, and benchmark profiles. A model scoring 70 on reasoning benchmarks might cost 20 times more per token than one scoring 65. Some tasks don't need the smartest model available; they need the fastest or cheapest one that clears a minimum quality bar. Without a unified place to see this, choosing a model is mostly trial and error.</w:t>
       </w:r>
     </w:p>
     <w:p>
@@ -162,7 +162,7 @@
           <w:i w:val="0"/>
           <w:sz w:val="24"/>
         </w:rPr>
-        <w:t>Existing tools each solve part of the problem. The LMSYS Chatbot Arena has good quality coverage but doesn't show pricing. The Hugging Face Open LLM Leaderboard is useful for open-weight models but doesn't include hosted API services. Provider pricing pages list costs but not benchmark scores. And none of them address local hardware compatibility — if you want to know whether Llama 3.3 70B will run on your GPU at a useful speed, you're cross-referencing multiple spec sheets and doing arithmetic by hand.</w:t>
+        <w:t>Existing tools each solve part of the problem. The LMSYS Chatbot Arena has good quality coverage but doesn't show pricing. The Hugging Face Open LLM Leaderboard is useful for open-weight models but doesn't include hosted API services. Provider pricing pages list costs but not benchmark scores. And none of them address local hardware compatibility: if you want to know whether Llama 3.3 70B will run on your GPU at a useful speed, you're cross-referencing multiple spec sheets and doing arithmetic by hand.</w:t>
       </w:r>
     </w:p>
     <w:p>
@@ -240,7 +240,7 @@
           <w:i w:val="0"/>
           <w:sz w:val="24"/>
         </w:rPr>
-        <w:t>Every successful response gets written to a live CSV cache and also saved as a timestamped snapshot. By mid-April 2026 over 30 daily snapshots had accumulated, which is what powers the Trends tab. The price field shown throughout the dashboard is a blended rate computed from raw input/output prices at a 3:1 output-to-input ratio — a rough approximation of real-world token usage, but better than showing two separate numbers on every chart.</w:t>
+        <w:t>Every successful response gets written to a live CSV cache and also saved as a timestamped snapshot. By mid-April 2026 over 30 daily snapshots had accumulated, which is what powers the Trends tab. The price field shown throughout the dashboard is a blended rate computed from raw input/output prices at a 3:1 output-to-input ratio, a rough approximation of real-world token usage, but better than showing two separate numbers on every chart.</w:t>
       </w:r>
     </w:p>
     <w:p>
@@ -271,7 +271,7 @@
           <w:i w:val="0"/>
           <w:sz w:val="24"/>
         </w:rPr>
-        <w:t>The local model catalog is a separate, manually maintained dataset. GPU specs — VRAM capacity and memory bandwidth — came from official product pages for NVIDIA, AMD, Apple, and Intel hardware. Model parameter counts and quantization support came from Hugging Face model cards. This one doesn't update automatically; I update it when a notable new GPU generation or model family ships. Hardware specs don't change the way API prices do, so a static catalog is the right call here.</w:t>
+        <w:t>The local model catalog is a separate, manually maintained dataset. GPU specs (VRAM capacity and memory bandwidth) came from official product pages for NVIDIA, AMD, Apple, and Intel hardware. Model parameter counts and quantization support came from Hugging Face model cards. This one doesn't update automatically; I update it when a notable new GPU generation or model family ships. Hardware specs don't change the way API prices do, so a static catalog is the right call here.</w:t>
       </w:r>
     </w:p>
     <w:p>
@@ -801,7 +801,7 @@
           <w:i w:val="0"/>
           <w:sz w:val="24"/>
         </w:rPr>
-        <w:t>Overview — bubble scatter with Pareto frontier. The problem with showing 255 models simultaneously is that a ranked list throws away the tradeoff information. A model ranked 5th might be half the price of the model ranked 4th with nearly identical quality. The bubble scatter puts price on the x-axis, quality on the y-axis, and encodes throughput as bubble size, so three variables are visible at once. Price needs to be on a log scale — the spread goes from under a cent to over $15 per million tokens, and a linear axis would compress nearly everything into one corner.</w:t>
+        <w:t>Overview (bubble scatter with Pareto frontier). The problem with showing 255 models simultaneously is that a ranked list throws away the tradeoff information. A model ranked 5th might be half the price of the model ranked 4th with nearly identical quality. The bubble scatter puts price on the x-axis, quality on the y-axis, and encodes throughput as bubble size, so three variables are visible at once. Price needs to be on a log scale: the spread goes from under a cent to over $15 per million tokens, and a linear axis would compress nearly everything into one corner.</w:t>
       </w:r>
     </w:p>
     <w:p>
@@ -889,7 +889,7 @@
           <w:i w:val="0"/>
           <w:sz w:val="24"/>
         </w:rPr>
-        <w:t>Rankings — horizontal bars with tier separators. Rankings are one-dimensional comparisons, and horizontal bars handle that more clearly than a scatter with one wasted axis. Tier separator lines appear wherever the gap between adjacent models is large enough to represent a real break in performance, not just noise. This keeps users from treating a 72 and a 71 as equivalent just because they're next to each other on the list.</w:t>
+        <w:t>Rankings (horizontal bars with tier separators). Rankings are one-dimensional comparisons, and horizontal bars handle that more clearly than a scatter with one wasted axis. Tier separator lines appear wherever the gap between adjacent models is large enough to represent a real break in performance, not just noise. This keeps users from treating a 72 and a 71 as equivalent just because they're next to each other on the list.</w:t>
       </w:r>
     </w:p>
     <w:p>
@@ -905,7 +905,7 @@
           <w:i w:val="0"/>
           <w:sz w:val="24"/>
         </w:rPr>
-        <w:t>Compare — radar chart. When you want to see how five models differ across five dimensions at once, a radar chart is the right tool. Each axis is normalized 0–5. The known limitation is that the shape depends on axis ordering, which is fixed — rearranging the axes would change what the polygon looks like without changing any underlying data. It's still more useful than five separate bar charts for getting a quick cross-model profile.</w:t>
+        <w:t>Compare (radar chart). When you want to see how five models differ across five dimensions at once, a radar chart is the right tool. Each axis is normalized 0–5. The known limitation is that the shape depends on axis ordering, which is fixed; rearranging the axes would change what the polygon looks like without changing any underlying data. It's still more useful than five separate bar charts for getting a quick cross-model profile.</w:t>
       </w:r>
     </w:p>
     <w:p>
@@ -977,7 +977,7 @@
           <w:i w:val="0"/>
           <w:sz w:val="24"/>
         </w:rPr>
-        <w:t>Landscape — treemap. Tile area encodes model count per provider; color intensity encodes average intelligence score. It answers a different question than the other tabs: who dominates by volume, which providers are newcomers with a narrow catalog, which ones specialize in high-capability models. A ranked bar chart sits directly below it for precise comparisons — the treemap gives the big picture, the bar chart gives the exact numbers.</w:t>
+        <w:t>Landscape (treemap). Tile area encodes model count per provider; color intensity encodes average intelligence score. It answers a different question than the other tabs: who dominates by volume, which providers are newcomers with a narrow catalog, which ones specialize in high-capability models. A ranked bar chart sits directly below it for precise comparisons — the treemap gives the big picture, the bar chart gives the exact numbers.</w:t>
       </w:r>
     </w:p>
     <w:p>
@@ -993,7 +993,7 @@
           <w:i w:val="0"/>
           <w:sz w:val="24"/>
         </w:rPr>
-        <w:t>Trends — line chart over time. This tab only works because the scraper saves timestamped snapshots rather than overwriting the same file. Looking at prices from February through April 2026 makes something obvious that a static dataset would hide completely: the market moved fast. Several major providers dropped prices significantly in that window.</w:t>
+        <w:t>Trends (line chart over time). This tab only works because the scraper saves timestamped snapshots rather than overwriting the same file. Looking at prices from February through April 2026 makes something obvious that a static dataset would hide completely: the market moved fast. Several major providers dropped prices significantly in that window.</w:t>
       </w:r>
     </w:p>
     <w:p>
@@ -1080,7 +1080,7 @@
           <w:i w:val="0"/>
           <w:sz w:val="24"/>
         </w:rPr>
-        <w:t>The most technically involved tab to build was Run Local. The question it answers — which open-weight models will actually fit on my GPU, and how fast will they run — isn't something any major leaderboard addresses. Running models locally has specific advantages: data stays on the machine, there's no per-token cost after the hardware is paid for, there's no network latency, and it works offline. The complication is that the answer depends on parameter count, quantization level, and the GPU's VRAM and memory bandwidth all interacting together. Working it out manually means pulling specs from several product pages and doing arithmetic — the tab automates all of that.</w:t>
+        <w:t>The most technically involved tab to build was Run Local. The question it answers — which open-weight models will actually fit on my GPU, and how fast will they run — isn't something any major leaderboard addresses. Running models locally has specific advantages: data stays on the machine, there's no per-token cost after the hardware is paid for, there's no network latency, and it works offline. The complication is that the answer depends on parameter count, quantization level, and the GPU's VRAM and memory bandwidth all interacting together. Working it out manually means pulling specs from several product pages and doing arithmetic. The tab automates all of that.</w:t>
       </w:r>
     </w:p>
     <w:p>
@@ -1128,7 +1128,7 @@
           <w:i w:val="0"/>
           <w:sz w:val="24"/>
         </w:rPr>
-        <w:t>Apple Silicon is worth calling out specifically. The M-series chips use unified memory, meaning the CPU, GPU, and neural engine all share the same physical pool. That makes the effective 'VRAM' the full system memory — 96 GB on an M2 Max, 192 GB on an M2 Ultra — rather than a discrete chip with its own fixed capacity. Combined with memory bandwidth that's competitive with mid-range discrete GPUs, this makes Apple Silicon surprisingly capable for local inference. An M3 Max at 128 GB can run a 70B model at Q4 comfortably; on an RTX 4090 (24 GB), that same model needs Q2 just to fit. The dashboard uses Apple's published bandwidth figures, so the estimates reflect real hardware rather than guesses.</w:t>
+        <w:t>Apple Silicon is worth calling out specifically. The M-series chips use unified memory, meaning the CPU, GPU, and neural engine all share the same physical pool. That makes the effective 'VRAM' the full system memory (96 GB on an M2 Max, 192 GB on an M2 Ultra), rather than a discrete chip with its own fixed capacity. Combined with memory bandwidth that's competitive with mid-range discrete GPUs, this makes Apple Silicon surprisingly capable for local inference. An M3 Max at 128 GB can run a 70B model at Q4 comfortably; on an RTX 4090 (24 GB), that same model needs Q2 just to fit. The dashboard uses Apple's published bandwidth figures, so the estimates reflect real hardware rather than guesses.</w:t>
       </w:r>
     </w:p>
     <w:p>
@@ -1144,7 +1144,7 @@
           <w:i w:val="0"/>
           <w:sz w:val="24"/>
         </w:rPr>
-        <w:t>The scatter plot shows incompatible models in muted gray rather than hiding them. That decision matters: a model needing 26 GB on a 24 GB card shows up dimmed rather than absent, so the user can see it's close and try a lower quantization level without guessing. Compatible models are plotted in full color with marker size proportional to parameter count, making it easy to spot where large-but-slow models cluster versus the smaller-but-faster ones. Dropping from Q8 to Q4 cuts VRAM roughly in half and doubles speed, but may shave a few benchmark points depending on the model — the scatter makes that tradeoff visible.</w:t>
+        <w:t>The scatter plot shows incompatible models in muted gray rather than hiding them. That decision matters: a model needing 26 GB on a 24 GB card shows up dimmed rather than absent, so the user can see it's close and try a lower quantization level without guessing. Compatible models are plotted in full color with marker size proportional to parameter count, making it easy to spot where large-but-slow models cluster versus the smaller-but-faster ones. Dropping from Q8 to Q4 cuts VRAM roughly in half and doubles speed, but may shave a few benchmark points depending on the model; the scatter makes that tradeoff visible.</w:t>
       </w:r>
     </w:p>
     <w:p>
@@ -1247,7 +1247,7 @@
           <w:i w:val="0"/>
           <w:sz w:val="24"/>
         </w:rPr>
-        <w:t>A few design choices applied across all eleven tabs. The biggest was data-ink ratio — every gridline, chart border, and legend entry that didn't encode actual data got removed. The dark background (#0a0a0a) helps here: dark backgrounds make data elements stand out without needing the heavy whitespace that a white-background chart at the same density would require.</w:t>
+        <w:t>A few design choices applied across all eleven tabs. The biggest was data-ink ratio: every gridline, chart border, and legend entry that didn't encode actual data got removed. The dark background (#0a0a0a) helps here: dark backgrounds make data elements stand out without needing the heavy whitespace that a white-background chart at the same density would require.</w:t>
       </w:r>
     </w:p>
     <w:p>
@@ -1263,7 +1263,7 @@
           <w:i w:val="0"/>
           <w:sz w:val="24"/>
         </w:rPr>
-        <w:t>Provider colors and marker shapes are both encoded on the same dots and bars, and they stay consistent across all eleven tabs. That came from a specific accessibility concern — someone with red-green colorblindness shouldn't need a separate mode to read the charts. Keeping the same shapes across tabs also means you only have to learn the legend once.</w:t>
+        <w:t>Provider colors and marker shapes are both encoded on the same dots and bars, and they stay consistent across all eleven tabs. That came from a specific accessibility concern: someone with red-green colorblindness shouldn't need a separate mode to read the charts. Keeping the same shapes across tabs also means you only have to learn the legend once.</w:t>
       </w:r>
     </w:p>
     <w:p>
@@ -1310,7 +1310,7 @@
           <w:i w:val="0"/>
           <w:sz w:val="24"/>
         </w:rPr>
-        <w:t>I built the whole stack in Python — data pipeline, scraper, and dashboard — using Plotly Dash for the web layer. Dash compiles Python component trees into a live web app without a JavaScript build step, which kept everything simple. No Node.js, no webpack, no separate API server. The whole thing starts with python app.py.</w:t>
+        <w:t>I built the whole stack in Python (data pipeline, scraper, and dashboard) using Plotly Dash for the web layer. Dash compiles Python component trees into a live web app without a JavaScript build step, which kept everything simple. No Node.js, no webpack, no separate API server. The whole thing starts with python app.py.</w:t>
       </w:r>
     </w:p>
     <w:p>
@@ -1326,7 +1326,7 @@
           <w:i w:val="0"/>
           <w:sz w:val="24"/>
         </w:rPr>
-        <w:t>The app is hosted on Render, which redeploys automatically on every GitHub push. The main tradeoff with Dash versus a React frontend is that client-side interactions need a server round-trip. In practice that wasn't a problem — the dataset is under a megabyte, callbacks come back in roughly 200ms on the Render instance, and the use case doesn't require instant client-side updates the way a real-time trading dashboard would.</w:t>
+        <w:t>The app is hosted on Render, which redeploys automatically on every GitHub push. The main tradeoff with Dash versus a React frontend is that client-side interactions need a server round-trip. In practice that wasn't a problem: the dataset is under a megabyte, callbacks come back in roughly 200ms on the Render instance, and the use case doesn't require instant client-side updates the way a real-time trading dashboard would.</w:t>
       </w:r>
     </w:p>
     <w:p>
@@ -1373,7 +1373,7 @@
           <w:i w:val="0"/>
           <w:sz w:val="24"/>
         </w:rPr>
-        <w:t>The Agent Stack tab goes a step further than ranking: given a workflow type, it recommends a three-tier model configuration — reasoning, balanced, and fast — and lists specific models at each tier. For anyone building an agentic pipeline, that's a more direct answer than scrolling a ranked list and making the configuration decision themselves.</w:t>
+        <w:t>The Agent Stack tab goes a step further than ranking: given a workflow type, it recommends a three-tier model configuration (reasoning, balanced, and fast) and lists specific models at each tier. For anyone building an agentic pipeline, that's a more direct answer than scrolling a ranked list and making the configuration decision themselves.</w:t>
       </w:r>
     </w:p>
     <w:p>
@@ -1508,7 +1508,7 @@
           <w:i w:val="0"/>
           <w:sz w:val="24"/>
         </w:rPr>
-        <w:t>Real measured latency by region would also be valuable. Published time-to-first-token medians from provider spec sheets don't always match what you actually see, especially under load. The hourly scraper is already running; adding a synthetic request layer would just mean logging actual response times alongside the existing metadata. A mobile layout is also on the list — most tabs are built for a wide desktop viewport and would need real work on smaller screens.</w:t>
+        <w:t>Real measured latency by region would also be valuable. Published time-to-first-token medians from provider spec sheets don't always match what you actually see, especially under load. The hourly scraper is already running; adding a synthetic request layer would just mean logging actual response times alongside the existing metadata. A mobile layout is also on the list; most tabs are built for a wide desktop viewport and would need real work on smaller screens.</w:t>
       </w:r>
     </w:p>
     <w:p>
@@ -1539,7 +1539,7 @@
           <w:i w:val="0"/>
           <w:sz w:val="24"/>
         </w:rPr>
-        <w:t>Building this project made a few things clear that weren't before. The LLM market moves fast enough that a static tool is basically outdated the week it's published — prices dropped meaningfully for several providers just in the time between starting this project and finishing it. The Run Local comparison ended up mattering more than expected: there are open-weight models that are competitive with paid APIs and run comfortably on consumer hardware, but you'd never know it without something that puts them on the same scale. The dashboard is still running at the GitHub link below and will keep updating as long as the Artificial Analysis API does.</w:t>
+        <w:t>Building this project made a few things clear that weren't before. The LLM market moves fast enough that a static tool is basically outdated the week it's published: prices dropped meaningfully for several providers just in the time between starting this project and finishing it. The Run Local comparison ended up mattering more than expected: there are open-weight models that are competitive with paid APIs and run comfortably on consumer hardware, but you'd never know it without something that puts them on the same scale. The dashboard is still running at the GitHub link below and will keep updating as long as the Artificial Analysis API does.</w:t>
       </w:r>
     </w:p>
     <w:p>

</xml_diff>